<commit_message>
Major platform update: admin dashboard, Pet Buddy, landing redesign, and Supabase migrations reorganization.
Adds admin/delivery roles, blueprint guided tour, push notifications, marketplace improvements, and consolidates SQL migrations under supabase/.

Co-authored-by: Cursor <cursoragent@cursor.com>
</commit_message>
<xml_diff>
--- a/Pendientes PetHub.docx
+++ b/Pendientes PetHub.docx
@@ -17,18 +17,8 @@
           <w:bCs/>
           <w:lang w:val="es-ES"/>
         </w:rPr>
-        <w:t xml:space="preserve">Pendientes </w:t>
+        <w:t>Pendientes PetHub</w:t>
       </w:r>
-      <w:proofErr w:type="spellStart"/>
-      <w:r>
-        <w:rPr>
-          <w:b/>
-          <w:bCs/>
-          <w:lang w:val="es-ES"/>
-        </w:rPr>
-        <w:t>PetHub</w:t>
-      </w:r>
-      <w:proofErr w:type="spellEnd"/>
     </w:p>
     <w:p>
       <w:pPr>
@@ -37,181 +27,6 @@
           <w:lang w:val="es-ES"/>
         </w:rPr>
       </w:pPr>
-    </w:p>
-    <w:p>
-      <w:pPr>
-        <w:pStyle w:val="Prrafodelista"/>
-        <w:numPr>
-          <w:ilvl w:val="0"/>
-          <w:numId w:val="1"/>
-        </w:numPr>
-        <w:jc w:val="both"/>
-        <w:rPr>
-          <w:lang w:val="es-ES"/>
-        </w:rPr>
-      </w:pPr>
-      <w:r>
-        <w:rPr>
-          <w:lang w:val="es-ES"/>
-        </w:rPr>
-        <w:t xml:space="preserve">Crear una </w:t>
-      </w:r>
-      <w:r>
-        <w:rPr>
-          <w:lang w:val="es-ES"/>
-        </w:rPr>
-        <w:t>página</w:t>
-      </w:r>
-      <w:r>
-        <w:rPr>
-          <w:lang w:val="es-ES"/>
-        </w:rPr>
-        <w:t xml:space="preserve"> </w:t>
-      </w:r>
-      <w:r>
-        <w:rPr>
-          <w:lang w:val="es-ES"/>
-        </w:rPr>
-        <w:t xml:space="preserve">para </w:t>
-      </w:r>
-      <w:proofErr w:type="spellStart"/>
-      <w:r>
-        <w:rPr>
-          <w:lang w:val="es-ES"/>
-        </w:rPr>
-        <w:t>admin</w:t>
-      </w:r>
-      <w:proofErr w:type="spellEnd"/>
-      <w:r>
-        <w:rPr>
-          <w:lang w:val="es-ES"/>
-        </w:rPr>
-        <w:t xml:space="preserve"> </w:t>
-      </w:r>
-      <w:r>
-        <w:rPr>
-          <w:lang w:val="es-ES"/>
-        </w:rPr>
-        <w:t>para ver todos los datos de todos los usuarios y monitorear usuarios, perfiles, productos, servicios, ordenes, etc.</w:t>
-      </w:r>
-      <w:r>
-        <w:rPr>
-          <w:lang w:val="es-ES"/>
-        </w:rPr>
-        <w:t xml:space="preserve"> Solo va a ser una </w:t>
-      </w:r>
-      <w:r>
-        <w:rPr>
-          <w:lang w:val="es-ES"/>
-        </w:rPr>
-        <w:t>página</w:t>
-      </w:r>
-      <w:r>
-        <w:rPr>
-          <w:lang w:val="es-ES"/>
-        </w:rPr>
-        <w:t xml:space="preserve"> fuera de</w:t>
-      </w:r>
-      <w:r>
-        <w:rPr>
-          <w:lang w:val="es-ES"/>
-        </w:rPr>
-        <w:t xml:space="preserve"> los tres </w:t>
-      </w:r>
-      <w:proofErr w:type="spellStart"/>
-      <w:r>
-        <w:rPr>
-          <w:lang w:val="es-ES"/>
-        </w:rPr>
-        <w:t>dashboards</w:t>
-      </w:r>
-      <w:proofErr w:type="spellEnd"/>
-      <w:r>
-        <w:rPr>
-          <w:lang w:val="es-ES"/>
-        </w:rPr>
-        <w:t>, llamada “</w:t>
-      </w:r>
-      <w:proofErr w:type="spellStart"/>
-      <w:r>
-        <w:rPr>
-          <w:lang w:val="es-ES"/>
-        </w:rPr>
-        <w:t>Admin</w:t>
-      </w:r>
-      <w:proofErr w:type="spellEnd"/>
-      <w:r>
-        <w:rPr>
-          <w:lang w:val="es-ES"/>
-        </w:rPr>
-        <w:t xml:space="preserve"> Panel”. Aquí va a tener la forma de un </w:t>
-      </w:r>
-      <w:proofErr w:type="spellStart"/>
-      <w:r>
-        <w:rPr>
-          <w:lang w:val="es-ES"/>
-        </w:rPr>
-        <w:t>dashboard</w:t>
-      </w:r>
-      <w:proofErr w:type="spellEnd"/>
-      <w:r>
-        <w:rPr>
-          <w:lang w:val="es-ES"/>
-        </w:rPr>
-        <w:t xml:space="preserve">, con un </w:t>
-      </w:r>
-      <w:proofErr w:type="spellStart"/>
-      <w:r>
-        <w:rPr>
-          <w:lang w:val="es-ES"/>
-        </w:rPr>
-        <w:t>side</w:t>
-      </w:r>
-      <w:proofErr w:type="spellEnd"/>
-      <w:r>
-        <w:rPr>
-          <w:lang w:val="es-ES"/>
-        </w:rPr>
-        <w:t xml:space="preserve"> menú con paginas como </w:t>
-      </w:r>
-      <w:r>
-        <w:rPr>
-          <w:lang w:val="es-ES"/>
-        </w:rPr>
-        <w:t>usuarios, mascotas, compras, reservas, análisis financiero</w:t>
-      </w:r>
-      <w:r>
-        <w:rPr>
-          <w:lang w:val="es-ES"/>
-        </w:rPr>
-        <w:t xml:space="preserve">, </w:t>
-      </w:r>
-      <w:r>
-        <w:rPr>
-          <w:lang w:val="es-ES"/>
-        </w:rPr>
-        <w:t xml:space="preserve">costos, </w:t>
-      </w:r>
-      <w:r>
-        <w:rPr>
-          <w:lang w:val="es-ES"/>
-        </w:rPr>
-        <w:t xml:space="preserve">análisis operativo (usuarios por mes, </w:t>
-      </w:r>
-      <w:proofErr w:type="spellStart"/>
-      <w:r>
-        <w:rPr>
-          <w:lang w:val="es-ES"/>
-        </w:rPr>
-        <w:t>etc</w:t>
-      </w:r>
-      <w:proofErr w:type="spellEnd"/>
-      <w:r>
-        <w:rPr>
-          <w:lang w:val="es-ES"/>
-        </w:rPr>
-        <w:t xml:space="preserve">), </w:t>
-      </w:r>
     </w:p>
     <w:p>
       <w:pPr>
@@ -260,21 +75,26 @@
         <w:rPr>
           <w:lang w:val="es-ES"/>
         </w:rPr>
-        <w:t xml:space="preserve"> hacer la plataforma </w:t>
+        <w:t xml:space="preserve"> hacer la plataforma multi-mascota, y no solo enfocado en perro</w:t>
       </w:r>
-      <w:proofErr w:type="spellStart"/>
+    </w:p>
+    <w:p>
+      <w:pPr>
+        <w:pStyle w:val="Prrafodelista"/>
+        <w:numPr>
+          <w:ilvl w:val="0"/>
+          <w:numId w:val="1"/>
+        </w:numPr>
+        <w:jc w:val="both"/>
+        <w:rPr>
+          <w:lang w:val="es-ES"/>
+        </w:rPr>
+      </w:pPr>
       <w:r>
         <w:rPr>
           <w:lang w:val="es-ES"/>
         </w:rPr>
-        <w:t>multi-mascota</w:t>
-      </w:r>
-      <w:proofErr w:type="spellEnd"/>
-      <w:r>
-        <w:rPr>
-          <w:lang w:val="es-ES"/>
-        </w:rPr>
-        <w:t>, y no solo enfocado en perro</w:t>
+        <w:t>Agregar monitoreo de gps para repartidores y agregar pagina de monitoreo para admin</w:t>
       </w:r>
     </w:p>
     <w:sectPr>

</xml_diff>